<commit_message>
Address review feedback (Leo)
- Slide numbers: relocate to bottom-right corner (explicit position) on
  content, title and divider slides; rebuild EN + VN decks.
- Instructor manual: fix per-session timings to fit 90 minutes (EN + VN).
- Remove 08_Advanced_Model (survival) pre-course lesson — not taught; clean
  up navigation references in READMEs and the Study Guide.
- Pre-course README: reframe to revolve around the Course_Preparation pack
  (participants only need this before training); EN + VN.
- Add Participant_Emails.md: ready-to-send invite + 1-day reminder (EN + VN).
- Regenerate Study Guide and Course Orientation to match.

Co-Authored-By: Claude Opus 4.8 <noreply@anthropic.com>
</commit_message>
<xml_diff>
--- a/Course_Preparation/00_READ_ME_FIRST/Study_Guide_EN.docx
+++ b/Course_Preparation/00_READ_ME_FIRST/Study_Guide_EN.docx
@@ -415,36 +415,6 @@
                 <w:sz w:val="20"/>
               </w:rPr>
               <w:t>The five lessons, in order.</w:t>
-            </w:r>
-          </w:p>
-        </w:tc>
-      </w:tr>
-      <w:tr>
-        <w:tc>
-          <w:tcPr>
-            <w:tcW w:type="dxa" w:w="4320"/>
-          </w:tcPr>
-          <w:p>
-            <w:r/>
-            <w:r>
-              <w:rPr>
-                <w:sz w:val="20"/>
-              </w:rPr>
-              <w:t>08_Advanced_Model/</w:t>
-            </w:r>
-          </w:p>
-        </w:tc>
-        <w:tc>
-          <w:tcPr>
-            <w:tcW w:type="dxa" w:w="4320"/>
-          </w:tcPr>
-          <w:p>
-            <w:r/>
-            <w:r>
-              <w:rPr>
-                <w:sz w:val="20"/>
-              </w:rPr>
-              <w:t>Optional bonus lesson (survival analysis).</w:t>
             </w:r>
           </w:p>
         </w:tc>
@@ -1559,7 +1529,7 @@
         <w:rPr>
           <w:rFonts w:ascii="Calibri" w:hAnsi="Calibri"/>
         </w:rPr>
-        <w:t xml:space="preserve">Do the lessons in order: </w:t>
+        <w:t xml:space="preserve">Do the five lessons in order: </w:t>
       </w:r>
       <w:r>
         <w:rPr>
@@ -1572,7 +1542,7 @@
         <w:rPr>
           <w:rFonts w:ascii="Calibri" w:hAnsi="Calibri"/>
         </w:rPr>
-        <w:t>. (08 is optional.)</w:t>
+        <w:t>.</w:t>
       </w:r>
     </w:p>
     <w:p>

</xml_diff>